<commit_message>
feat(UseCaseDiagram): add use cases of customer & staff
</commit_message>
<xml_diff>
--- a/Documents/Design_Report_Template.docx
+++ b/Documents/Design_Report_Template.docx
@@ -201,7 +201,7 @@
           <w:color w:val="FF0000"/>
           <w:sz w:val="40"/>
         </w:rPr>
-        <w:t>Full Name of Student1 (Reg Num)</w:t>
+        <w:t>Sean Nathan Albus Policarpio Esguerra</w:t>
       </w:r>
     </w:p>
     <w:p>
@@ -279,7 +279,7 @@
           <w:color w:val="FF0000"/>
           <w:sz w:val="40"/>
         </w:rPr>
-        <w:t>XX</w:t>
+        <w:t>04</w:t>
       </w:r>
       <w:r>
         <w:rPr>
@@ -290,6 +290,7 @@
         </w:rPr>
         <w:t xml:space="preserve"> – </w:t>
       </w:r>
+      <w:proofErr w:type="spellStart"/>
       <w:r>
         <w:rPr>
           <w:rFonts w:ascii="Helvetica" w:hAnsi="Helvetica"/>
@@ -308,6 +309,7 @@
         </w:rPr>
         <w:t>YY</w:t>
       </w:r>
+      <w:proofErr w:type="spellEnd"/>
     </w:p>
     <w:p>
       <w:pPr>
@@ -337,6 +339,14 @@
           <w:sz w:val="36"/>
         </w:rPr>
       </w:pPr>
+      <w:r>
+        <w:rPr>
+          <w:b/>
+          <w:bCs w:val="0"/>
+          <w:sz w:val="36"/>
+        </w:rPr>
+        <w:t>Sandwich Order System</w:t>
+      </w:r>
     </w:p>
     <w:p>
       <w:pPr>
@@ -391,14 +401,7 @@
           <w:sz w:val="28"/>
           <w:szCs w:val="28"/>
         </w:rPr>
-        <w:t>I am</w:t>
-      </w:r>
-      <w:r>
-        <w:rPr>
-          <w:sz w:val="28"/>
-          <w:szCs w:val="28"/>
-        </w:rPr>
-        <w:t>/We are</w:t>
+        <w:t>We are</w:t>
       </w:r>
       <w:r>
         <w:rPr>
@@ -434,15 +437,7 @@
           <w:szCs w:val="28"/>
           <w:lang w:val="en-US"/>
         </w:rPr>
-        <w:t>I</w:t>
-      </w:r>
-      <w:r>
-        <w:rPr>
-          <w:sz w:val="28"/>
-          <w:szCs w:val="28"/>
-          <w:lang w:val="en-US"/>
-        </w:rPr>
-        <w:t xml:space="preserve">/we </w:t>
+        <w:t xml:space="preserve">we </w:t>
       </w:r>
       <w:r>
         <w:rPr>
@@ -1459,6 +1454,15 @@
             <w:pPr>
               <w:pStyle w:val="NoSpacing"/>
             </w:pPr>
+            <w:r>
+              <w:t xml:space="preserve">Create initial </w:t>
+            </w:r>
+            <w:r>
+              <w:t>GitHub repository</w:t>
+            </w:r>
+            <w:r>
+              <w:t xml:space="preserve"> and files</w:t>
+            </w:r>
           </w:p>
         </w:tc>
         <w:tc>
@@ -1469,6 +1473,53 @@
             <w:pPr>
               <w:pStyle w:val="NoSpacing"/>
             </w:pPr>
+            <w:r>
+              <w:t>Albus</w:t>
+            </w:r>
+          </w:p>
+        </w:tc>
+        <w:tc>
+          <w:tcPr>
+            <w:tcW w:w="3260" w:type="dxa"/>
+          </w:tcPr>
+          <w:p>
+            <w:pPr>
+              <w:pStyle w:val="NoSpacing"/>
+            </w:pPr>
+            <w:r>
+              <w:t>Y</w:t>
+            </w:r>
+          </w:p>
+        </w:tc>
+      </w:tr>
+      <w:tr>
+        <w:tc>
+          <w:tcPr>
+            <w:tcW w:w="3402" w:type="dxa"/>
+          </w:tcPr>
+          <w:p>
+            <w:pPr>
+              <w:pStyle w:val="NoSpacing"/>
+            </w:pPr>
+            <w:r>
+              <w:t>Create</w:t>
+            </w:r>
+            <w:r>
+              <w:t xml:space="preserve"> Use Case Diagram</w:t>
+            </w:r>
+          </w:p>
+        </w:tc>
+        <w:tc>
+          <w:tcPr>
+            <w:tcW w:w="2551" w:type="dxa"/>
+          </w:tcPr>
+          <w:p>
+            <w:pPr>
+              <w:pStyle w:val="NoSpacing"/>
+            </w:pPr>
+            <w:r>
+              <w:t>Albus</w:t>
+            </w:r>
           </w:p>
         </w:tc>
         <w:tc>
@@ -1491,6 +1542,18 @@
             <w:pPr>
               <w:pStyle w:val="NoSpacing"/>
             </w:pPr>
+            <w:r>
+              <w:t>Crea</w:t>
+            </w:r>
+            <w:r>
+              <w:t>te</w:t>
+            </w:r>
+            <w:r>
+              <w:t xml:space="preserve"> </w:t>
+            </w:r>
+            <w:r>
+              <w:t>Class Diagram</w:t>
+            </w:r>
           </w:p>
         </w:tc>
         <w:tc>
@@ -1501,6 +1564,9 @@
             <w:pPr>
               <w:pStyle w:val="NoSpacing"/>
             </w:pPr>
+            <w:r>
+              <w:t>Shi Cheng</w:t>
+            </w:r>
           </w:p>
         </w:tc>
         <w:tc>
@@ -1523,6 +1589,15 @@
             <w:pPr>
               <w:pStyle w:val="NoSpacing"/>
             </w:pPr>
+            <w:r>
+              <w:t>Writ</w:t>
+            </w:r>
+            <w:r>
+              <w:t>e project</w:t>
+            </w:r>
+            <w:r>
+              <w:t xml:space="preserve"> objectives</w:t>
+            </w:r>
           </w:p>
         </w:tc>
         <w:tc>
@@ -1533,6 +1608,85 @@
             <w:pPr>
               <w:pStyle w:val="NoSpacing"/>
             </w:pPr>
+            <w:r>
+              <w:t>Albus &amp; Shi Cheng</w:t>
+            </w:r>
+          </w:p>
+        </w:tc>
+        <w:tc>
+          <w:tcPr>
+            <w:tcW w:w="3260" w:type="dxa"/>
+          </w:tcPr>
+          <w:p>
+            <w:pPr>
+              <w:pStyle w:val="NoSpacing"/>
+            </w:pPr>
+          </w:p>
+        </w:tc>
+      </w:tr>
+      <w:tr>
+        <w:tc>
+          <w:tcPr>
+            <w:tcW w:w="3402" w:type="dxa"/>
+          </w:tcPr>
+          <w:p>
+            <w:pPr>
+              <w:pStyle w:val="NoSpacing"/>
+            </w:pPr>
+            <w:r>
+              <w:t>Write work distribution</w:t>
+            </w:r>
+          </w:p>
+        </w:tc>
+        <w:tc>
+          <w:tcPr>
+            <w:tcW w:w="2551" w:type="dxa"/>
+          </w:tcPr>
+          <w:p>
+            <w:pPr>
+              <w:pStyle w:val="NoSpacing"/>
+            </w:pPr>
+            <w:r>
+              <w:t>Albus &amp; Shi Cheng</w:t>
+            </w:r>
+          </w:p>
+        </w:tc>
+        <w:tc>
+          <w:tcPr>
+            <w:tcW w:w="3260" w:type="dxa"/>
+          </w:tcPr>
+          <w:p>
+            <w:pPr>
+              <w:pStyle w:val="NoSpacing"/>
+            </w:pPr>
+          </w:p>
+        </w:tc>
+      </w:tr>
+      <w:tr>
+        <w:tc>
+          <w:tcPr>
+            <w:tcW w:w="3402" w:type="dxa"/>
+          </w:tcPr>
+          <w:p>
+            <w:pPr>
+              <w:pStyle w:val="NoSpacing"/>
+            </w:pPr>
+            <w:r>
+              <w:t>Write report conclusion</w:t>
+            </w:r>
+          </w:p>
+        </w:tc>
+        <w:tc>
+          <w:tcPr>
+            <w:tcW w:w="2551" w:type="dxa"/>
+          </w:tcPr>
+          <w:p>
+            <w:pPr>
+              <w:pStyle w:val="NoSpacing"/>
+            </w:pPr>
+            <w:r>
+              <w:t>Albus &amp; Shi Cheng</w:t>
+            </w:r>
           </w:p>
         </w:tc>
         <w:tc>
@@ -1643,6 +1797,130 @@
       </w:r>
     </w:p>
     <w:p/>
+    <w:p/>
+    <w:p>
+      <w:r>
+        <w:t>Rough notes (Albus)</w:t>
+      </w:r>
+    </w:p>
+    <w:p>
+      <w:r>
+        <w:t xml:space="preserve">Problems: </w:t>
+      </w:r>
+    </w:p>
+    <w:p>
+      <w:pPr>
+        <w:pStyle w:val="ListParagraph"/>
+        <w:numPr>
+          <w:ilvl w:val="0"/>
+          <w:numId w:val="18"/>
+        </w:numPr>
+      </w:pPr>
+      <w:r>
+        <w:t>Setting up a GitHub repository initially with Eclipse is unintuitive</w:t>
+      </w:r>
+    </w:p>
+    <w:p>
+      <w:pPr>
+        <w:pStyle w:val="ListParagraph"/>
+        <w:numPr>
+          <w:ilvl w:val="0"/>
+          <w:numId w:val="18"/>
+        </w:numPr>
+      </w:pPr>
+      <w:r>
+        <w:t>Unsure of scope of project report requirements for features</w:t>
+      </w:r>
+    </w:p>
+    <w:p>
+      <w:pPr>
+        <w:pStyle w:val="ListParagraph"/>
+        <w:numPr>
+          <w:ilvl w:val="0"/>
+          <w:numId w:val="18"/>
+        </w:numPr>
+      </w:pPr>
+      <w:r>
+        <w:t>Unsure of what can be assumed and not assumed</w:t>
+      </w:r>
+    </w:p>
+    <w:p/>
+    <w:p>
+      <w:r>
+        <w:t>Learning:</w:t>
+      </w:r>
+    </w:p>
+    <w:p>
+      <w:pPr>
+        <w:pStyle w:val="ListParagraph"/>
+        <w:numPr>
+          <w:ilvl w:val="0"/>
+          <w:numId w:val="18"/>
+        </w:numPr>
+      </w:pPr>
+      <w:r>
+        <w:t>S</w:t>
+      </w:r>
+      <w:r>
+        <w:t>et up GitHub repository by utiliz</w:t>
+      </w:r>
+      <w:r>
+        <w:t>ing</w:t>
+      </w:r>
+      <w:r>
+        <w:t xml:space="preserve"> Claude AI to guide set-up</w:t>
+      </w:r>
+    </w:p>
+    <w:p>
+      <w:pPr>
+        <w:pStyle w:val="ListParagraph"/>
+        <w:numPr>
+          <w:ilvl w:val="0"/>
+          <w:numId w:val="18"/>
+        </w:numPr>
+      </w:pPr>
+      <w:r>
+        <w:t xml:space="preserve">Taking the initiative to ask questions to clarify </w:t>
+      </w:r>
+      <w:r>
+        <w:t>doubts rather than assuming</w:t>
+      </w:r>
+    </w:p>
+    <w:p>
+      <w:pPr>
+        <w:pStyle w:val="ListParagraph"/>
+        <w:numPr>
+          <w:ilvl w:val="0"/>
+          <w:numId w:val="18"/>
+        </w:numPr>
+      </w:pPr>
+      <w:r>
+        <w:t>Delegating and collaborating on tasks with others using GitHub</w:t>
+      </w:r>
+    </w:p>
+    <w:p/>
+    <w:p>
+      <w:r>
+        <w:t>Next Stage:</w:t>
+      </w:r>
+    </w:p>
+    <w:p>
+      <w:pPr>
+        <w:pStyle w:val="ListParagraph"/>
+        <w:numPr>
+          <w:ilvl w:val="0"/>
+          <w:numId w:val="18"/>
+        </w:numPr>
+      </w:pPr>
+      <w:r>
+        <w:t>TBD</w:t>
+      </w:r>
+    </w:p>
+    <w:p>
+      <w:r>
+        <w:t xml:space="preserve"> </w:t>
+      </w:r>
+    </w:p>
     <w:sectPr>
       <w:headerReference w:type="default" r:id="rId7"/>
       <w:footerReference w:type="even" r:id="rId8"/>
@@ -2636,6 +2914,118 @@
     </w:lvl>
   </w:abstractNum>
   <w:abstractNum w:abstractNumId="6" w15:restartNumberingAfterBreak="0">
+    <w:nsid w:val="2C08641A"/>
+    <w:multiLevelType w:val="hybridMultilevel"/>
+    <w:tmpl w:val="F266B5D6"/>
+    <w:lvl w:ilvl="0" w:tplc="0F42C71C">
+      <w:numFmt w:val="bullet"/>
+      <w:lvlText w:val="-"/>
+      <w:lvlJc w:val="left"/>
+      <w:pPr>
+        <w:ind w:left="720" w:hanging="360"/>
+      </w:pPr>
+      <w:rPr>
+        <w:rFonts w:ascii="Arial" w:eastAsia="Times New Roman" w:hAnsi="Arial" w:cs="Arial" w:hint="default"/>
+      </w:rPr>
+    </w:lvl>
+    <w:lvl w:ilvl="1" w:tplc="48090003" w:tentative="1">
+      <w:start w:val="1"/>
+      <w:numFmt w:val="bullet"/>
+      <w:lvlText w:val="o"/>
+      <w:lvlJc w:val="left"/>
+      <w:pPr>
+        <w:ind w:left="1440" w:hanging="360"/>
+      </w:pPr>
+      <w:rPr>
+        <w:rFonts w:ascii="Courier New" w:hAnsi="Courier New" w:cs="Courier New" w:hint="default"/>
+      </w:rPr>
+    </w:lvl>
+    <w:lvl w:ilvl="2" w:tplc="48090005" w:tentative="1">
+      <w:start w:val="1"/>
+      <w:numFmt w:val="bullet"/>
+      <w:lvlText w:val=""/>
+      <w:lvlJc w:val="left"/>
+      <w:pPr>
+        <w:ind w:left="2160" w:hanging="360"/>
+      </w:pPr>
+      <w:rPr>
+        <w:rFonts w:ascii="Wingdings" w:hAnsi="Wingdings" w:hint="default"/>
+      </w:rPr>
+    </w:lvl>
+    <w:lvl w:ilvl="3" w:tplc="48090001" w:tentative="1">
+      <w:start w:val="1"/>
+      <w:numFmt w:val="bullet"/>
+      <w:lvlText w:val=""/>
+      <w:lvlJc w:val="left"/>
+      <w:pPr>
+        <w:ind w:left="2880" w:hanging="360"/>
+      </w:pPr>
+      <w:rPr>
+        <w:rFonts w:ascii="Symbol" w:hAnsi="Symbol" w:hint="default"/>
+      </w:rPr>
+    </w:lvl>
+    <w:lvl w:ilvl="4" w:tplc="48090003" w:tentative="1">
+      <w:start w:val="1"/>
+      <w:numFmt w:val="bullet"/>
+      <w:lvlText w:val="o"/>
+      <w:lvlJc w:val="left"/>
+      <w:pPr>
+        <w:ind w:left="3600" w:hanging="360"/>
+      </w:pPr>
+      <w:rPr>
+        <w:rFonts w:ascii="Courier New" w:hAnsi="Courier New" w:cs="Courier New" w:hint="default"/>
+      </w:rPr>
+    </w:lvl>
+    <w:lvl w:ilvl="5" w:tplc="48090005" w:tentative="1">
+      <w:start w:val="1"/>
+      <w:numFmt w:val="bullet"/>
+      <w:lvlText w:val=""/>
+      <w:lvlJc w:val="left"/>
+      <w:pPr>
+        <w:ind w:left="4320" w:hanging="360"/>
+      </w:pPr>
+      <w:rPr>
+        <w:rFonts w:ascii="Wingdings" w:hAnsi="Wingdings" w:hint="default"/>
+      </w:rPr>
+    </w:lvl>
+    <w:lvl w:ilvl="6" w:tplc="48090001" w:tentative="1">
+      <w:start w:val="1"/>
+      <w:numFmt w:val="bullet"/>
+      <w:lvlText w:val=""/>
+      <w:lvlJc w:val="left"/>
+      <w:pPr>
+        <w:ind w:left="5040" w:hanging="360"/>
+      </w:pPr>
+      <w:rPr>
+        <w:rFonts w:ascii="Symbol" w:hAnsi="Symbol" w:hint="default"/>
+      </w:rPr>
+    </w:lvl>
+    <w:lvl w:ilvl="7" w:tplc="48090003" w:tentative="1">
+      <w:start w:val="1"/>
+      <w:numFmt w:val="bullet"/>
+      <w:lvlText w:val="o"/>
+      <w:lvlJc w:val="left"/>
+      <w:pPr>
+        <w:ind w:left="5760" w:hanging="360"/>
+      </w:pPr>
+      <w:rPr>
+        <w:rFonts w:ascii="Courier New" w:hAnsi="Courier New" w:cs="Courier New" w:hint="default"/>
+      </w:rPr>
+    </w:lvl>
+    <w:lvl w:ilvl="8" w:tplc="48090005" w:tentative="1">
+      <w:start w:val="1"/>
+      <w:numFmt w:val="bullet"/>
+      <w:lvlText w:val=""/>
+      <w:lvlJc w:val="left"/>
+      <w:pPr>
+        <w:ind w:left="6480" w:hanging="360"/>
+      </w:pPr>
+      <w:rPr>
+        <w:rFonts w:ascii="Wingdings" w:hAnsi="Wingdings" w:hint="default"/>
+      </w:rPr>
+    </w:lvl>
+  </w:abstractNum>
+  <w:abstractNum w:abstractNumId="7" w15:restartNumberingAfterBreak="0">
     <w:nsid w:val="2DD91A23"/>
     <w:multiLevelType w:val="hybridMultilevel"/>
     <w:tmpl w:val="EF8C890A"/>
@@ -2748,7 +3138,7 @@
       </w:rPr>
     </w:lvl>
   </w:abstractNum>
-  <w:abstractNum w:abstractNumId="7" w15:restartNumberingAfterBreak="0">
+  <w:abstractNum w:abstractNumId="8" w15:restartNumberingAfterBreak="0">
     <w:nsid w:val="2E00765F"/>
     <w:multiLevelType w:val="hybridMultilevel"/>
     <w:tmpl w:val="C786FF42"/>
@@ -2861,7 +3251,7 @@
       </w:rPr>
     </w:lvl>
   </w:abstractNum>
-  <w:abstractNum w:abstractNumId="8" w15:restartNumberingAfterBreak="0">
+  <w:abstractNum w:abstractNumId="9" w15:restartNumberingAfterBreak="0">
     <w:nsid w:val="2FE65094"/>
     <w:multiLevelType w:val="hybridMultilevel"/>
     <w:tmpl w:val="832E20B2"/>
@@ -2978,7 +3368,7 @@
       </w:pPr>
     </w:lvl>
   </w:abstractNum>
-  <w:abstractNum w:abstractNumId="9" w15:restartNumberingAfterBreak="0">
+  <w:abstractNum w:abstractNumId="10" w15:restartNumberingAfterBreak="0">
     <w:nsid w:val="4B861F40"/>
     <w:multiLevelType w:val="hybridMultilevel"/>
     <w:tmpl w:val="86726A46"/>
@@ -3090,7 +3480,7 @@
       </w:rPr>
     </w:lvl>
   </w:abstractNum>
-  <w:abstractNum w:abstractNumId="10" w15:restartNumberingAfterBreak="0">
+  <w:abstractNum w:abstractNumId="11" w15:restartNumberingAfterBreak="0">
     <w:nsid w:val="559F06FC"/>
     <w:multiLevelType w:val="hybridMultilevel"/>
     <w:tmpl w:val="D68A077C"/>
@@ -3207,7 +3597,7 @@
       </w:pPr>
     </w:lvl>
   </w:abstractNum>
-  <w:abstractNum w:abstractNumId="11" w15:restartNumberingAfterBreak="0">
+  <w:abstractNum w:abstractNumId="12" w15:restartNumberingAfterBreak="0">
     <w:nsid w:val="58B26002"/>
     <w:multiLevelType w:val="hybridMultilevel"/>
     <w:tmpl w:val="4E50ABC4"/>
@@ -3347,7 +3737,7 @@
       </w:rPr>
     </w:lvl>
   </w:abstractNum>
-  <w:abstractNum w:abstractNumId="12" w15:restartNumberingAfterBreak="0">
+  <w:abstractNum w:abstractNumId="13" w15:restartNumberingAfterBreak="0">
     <w:nsid w:val="61595836"/>
     <w:multiLevelType w:val="hybridMultilevel"/>
     <w:tmpl w:val="3648C0AA"/>
@@ -3487,7 +3877,7 @@
       </w:rPr>
     </w:lvl>
   </w:abstractNum>
-  <w:abstractNum w:abstractNumId="13" w15:restartNumberingAfterBreak="0">
+  <w:abstractNum w:abstractNumId="14" w15:restartNumberingAfterBreak="0">
     <w:nsid w:val="64A14AD5"/>
     <w:multiLevelType w:val="hybridMultilevel"/>
     <w:tmpl w:val="876CCB10"/>
@@ -3627,7 +4017,7 @@
       </w:rPr>
     </w:lvl>
   </w:abstractNum>
-  <w:abstractNum w:abstractNumId="14" w15:restartNumberingAfterBreak="0">
+  <w:abstractNum w:abstractNumId="15" w15:restartNumberingAfterBreak="0">
     <w:nsid w:val="65176774"/>
     <w:multiLevelType w:val="hybridMultilevel"/>
     <w:tmpl w:val="4886CB1C"/>
@@ -3767,7 +4157,7 @@
       </w:rPr>
     </w:lvl>
   </w:abstractNum>
-  <w:abstractNum w:abstractNumId="15" w15:restartNumberingAfterBreak="0">
+  <w:abstractNum w:abstractNumId="16" w15:restartNumberingAfterBreak="0">
     <w:nsid w:val="6A24302E"/>
     <w:multiLevelType w:val="hybridMultilevel"/>
     <w:tmpl w:val="0AA48548"/>
@@ -3907,7 +4297,7 @@
       </w:rPr>
     </w:lvl>
   </w:abstractNum>
-  <w:abstractNum w:abstractNumId="16" w15:restartNumberingAfterBreak="0">
+  <w:abstractNum w:abstractNumId="17" w15:restartNumberingAfterBreak="0">
     <w:nsid w:val="7D4F089E"/>
     <w:multiLevelType w:val="hybridMultilevel"/>
     <w:tmpl w:val="7744F60C"/>
@@ -4048,10 +4438,10 @@
     </w:lvl>
   </w:abstractNum>
   <w:num w:numId="1" w16cid:durableId="1598564673">
-    <w:abstractNumId w:val="10"/>
+    <w:abstractNumId w:val="11"/>
   </w:num>
   <w:num w:numId="2" w16cid:durableId="1883442310">
-    <w:abstractNumId w:val="8"/>
+    <w:abstractNumId w:val="9"/>
   </w:num>
   <w:num w:numId="3" w16cid:durableId="721290661">
     <w:abstractNumId w:val="0"/>
@@ -4063,31 +4453,31 @@
     <w:abstractNumId w:val="5"/>
   </w:num>
   <w:num w:numId="6" w16cid:durableId="1453743896">
+    <w:abstractNumId w:val="13"/>
+  </w:num>
+  <w:num w:numId="7" w16cid:durableId="1949004842">
+    <w:abstractNumId w:val="7"/>
+  </w:num>
+  <w:num w:numId="8" w16cid:durableId="1303540708">
     <w:abstractNumId w:val="12"/>
   </w:num>
-  <w:num w:numId="7" w16cid:durableId="1949004842">
-    <w:abstractNumId w:val="6"/>
-  </w:num>
-  <w:num w:numId="8" w16cid:durableId="1303540708">
-    <w:abstractNumId w:val="11"/>
-  </w:num>
   <w:num w:numId="9" w16cid:durableId="966083656">
-    <w:abstractNumId w:val="15"/>
+    <w:abstractNumId w:val="16"/>
   </w:num>
   <w:num w:numId="10" w16cid:durableId="1068840648">
-    <w:abstractNumId w:val="13"/>
+    <w:abstractNumId w:val="14"/>
   </w:num>
   <w:num w:numId="11" w16cid:durableId="1287157086">
-    <w:abstractNumId w:val="9"/>
+    <w:abstractNumId w:val="10"/>
   </w:num>
   <w:num w:numId="12" w16cid:durableId="1983999551">
     <w:abstractNumId w:val="3"/>
   </w:num>
   <w:num w:numId="13" w16cid:durableId="642122962">
-    <w:abstractNumId w:val="14"/>
+    <w:abstractNumId w:val="15"/>
   </w:num>
   <w:num w:numId="14" w16cid:durableId="470444103">
-    <w:abstractNumId w:val="16"/>
+    <w:abstractNumId w:val="17"/>
   </w:num>
   <w:num w:numId="15" w16cid:durableId="1194149697">
     <w:abstractNumId w:val="2"/>
@@ -4096,7 +4486,10 @@
     <w:abstractNumId w:val="4"/>
   </w:num>
   <w:num w:numId="17" w16cid:durableId="1348672571">
-    <w:abstractNumId w:val="7"/>
+    <w:abstractNumId w:val="8"/>
+  </w:num>
+  <w:num w:numId="18" w16cid:durableId="162597781">
+    <w:abstractNumId w:val="6"/>
   </w:num>
   <w:numIdMacAtCleanup w:val="5"/>
 </w:numbering>
@@ -4129,6 +4522,50 @@
     <w:lsdException w:name="Subtitle" w:qFormat="1"/>
     <w:lsdException w:name="Strong" w:qFormat="1"/>
     <w:lsdException w:name="Emphasis" w:qFormat="1"/>
+    <w:lsdException w:name="Normal Table" w:semiHidden="1" w:unhideWhenUsed="1"/>
+    <w:lsdException w:name="Table Simple 1" w:semiHidden="1" w:unhideWhenUsed="1"/>
+    <w:lsdException w:name="Table Simple 2" w:semiHidden="1" w:unhideWhenUsed="1"/>
+    <w:lsdException w:name="Table Simple 3" w:semiHidden="1" w:unhideWhenUsed="1"/>
+    <w:lsdException w:name="Table Classic 1" w:semiHidden="1" w:unhideWhenUsed="1"/>
+    <w:lsdException w:name="Table Classic 2" w:semiHidden="1" w:unhideWhenUsed="1"/>
+    <w:lsdException w:name="Table Classic 3" w:semiHidden="1" w:unhideWhenUsed="1"/>
+    <w:lsdException w:name="Table Classic 4" w:semiHidden="1" w:unhideWhenUsed="1"/>
+    <w:lsdException w:name="Table Colorful 1" w:semiHidden="1" w:unhideWhenUsed="1"/>
+    <w:lsdException w:name="Table Colorful 2" w:semiHidden="1" w:unhideWhenUsed="1"/>
+    <w:lsdException w:name="Table Colorful 3" w:semiHidden="1" w:unhideWhenUsed="1"/>
+    <w:lsdException w:name="Table Columns 1" w:semiHidden="1" w:unhideWhenUsed="1"/>
+    <w:lsdException w:name="Table Columns 2" w:semiHidden="1" w:unhideWhenUsed="1"/>
+    <w:lsdException w:name="Table Columns 3" w:semiHidden="1" w:unhideWhenUsed="1"/>
+    <w:lsdException w:name="Table Columns 4" w:semiHidden="1" w:unhideWhenUsed="1"/>
+    <w:lsdException w:name="Table Columns 5" w:semiHidden="1" w:unhideWhenUsed="1"/>
+    <w:lsdException w:name="Table Grid 1" w:semiHidden="1" w:unhideWhenUsed="1"/>
+    <w:lsdException w:name="Table Grid 2" w:semiHidden="1" w:unhideWhenUsed="1"/>
+    <w:lsdException w:name="Table Grid 3" w:semiHidden="1" w:unhideWhenUsed="1"/>
+    <w:lsdException w:name="Table Grid 4" w:semiHidden="1" w:unhideWhenUsed="1"/>
+    <w:lsdException w:name="Table Grid 5" w:semiHidden="1" w:unhideWhenUsed="1"/>
+    <w:lsdException w:name="Table Grid 6" w:semiHidden="1" w:unhideWhenUsed="1"/>
+    <w:lsdException w:name="Table Grid 7" w:semiHidden="1" w:unhideWhenUsed="1"/>
+    <w:lsdException w:name="Table Grid 8" w:semiHidden="1" w:unhideWhenUsed="1"/>
+    <w:lsdException w:name="Table List 1" w:semiHidden="1" w:unhideWhenUsed="1"/>
+    <w:lsdException w:name="Table List 2" w:semiHidden="1" w:unhideWhenUsed="1"/>
+    <w:lsdException w:name="Table List 3" w:semiHidden="1" w:unhideWhenUsed="1"/>
+    <w:lsdException w:name="Table List 4" w:semiHidden="1" w:unhideWhenUsed="1"/>
+    <w:lsdException w:name="Table List 5" w:semiHidden="1" w:unhideWhenUsed="1"/>
+    <w:lsdException w:name="Table List 6" w:semiHidden="1" w:unhideWhenUsed="1"/>
+    <w:lsdException w:name="Table List 7" w:semiHidden="1" w:unhideWhenUsed="1"/>
+    <w:lsdException w:name="Table List 8" w:semiHidden="1" w:unhideWhenUsed="1"/>
+    <w:lsdException w:name="Table 3D effects 1" w:semiHidden="1" w:unhideWhenUsed="1"/>
+    <w:lsdException w:name="Table 3D effects 2" w:semiHidden="1" w:unhideWhenUsed="1"/>
+    <w:lsdException w:name="Table 3D effects 3" w:semiHidden="1" w:unhideWhenUsed="1"/>
+    <w:lsdException w:name="Table Contemporary" w:semiHidden="1" w:unhideWhenUsed="1"/>
+    <w:lsdException w:name="Table Elegant" w:semiHidden="1" w:unhideWhenUsed="1"/>
+    <w:lsdException w:name="Table Professional" w:semiHidden="1" w:unhideWhenUsed="1"/>
+    <w:lsdException w:name="Table Subtle 1" w:semiHidden="1" w:unhideWhenUsed="1"/>
+    <w:lsdException w:name="Table Subtle 2" w:semiHidden="1" w:unhideWhenUsed="1"/>
+    <w:lsdException w:name="Table Web 1" w:semiHidden="1" w:unhideWhenUsed="1"/>
+    <w:lsdException w:name="Table Web 2" w:semiHidden="1" w:unhideWhenUsed="1"/>
+    <w:lsdException w:name="Table Web 3" w:semiHidden="1" w:unhideWhenUsed="1"/>
+    <w:lsdException w:name="Table Theme" w:semiHidden="1" w:unhideWhenUsed="1"/>
     <w:lsdException w:name="Placeholder Text" w:semiHidden="1" w:uiPriority="99"/>
     <w:lsdException w:name="No Spacing" w:uiPriority="1" w:qFormat="1"/>
     <w:lsdException w:name="Light Shading" w:uiPriority="60"/>
@@ -4446,11 +4883,15 @@
   </w:style>
   <w:style w:type="character" w:default="1" w:styleId="DefaultParagraphFont">
     <w:name w:val="Default Paragraph Font"/>
+    <w:uiPriority w:val="1"/>
     <w:semiHidden/>
+    <w:unhideWhenUsed/>
   </w:style>
   <w:style w:type="table" w:default="1" w:styleId="TableNormal">
     <w:name w:val="Normal Table"/>
+    <w:uiPriority w:val="99"/>
     <w:semiHidden/>
+    <w:unhideWhenUsed/>
     <w:tblPr>
       <w:tblInd w:w="0" w:type="dxa"/>
       <w:tblCellMar>
@@ -4463,7 +4904,9 @@
   </w:style>
   <w:style w:type="numbering" w:default="1" w:styleId="NoList">
     <w:name w:val="No List"/>
+    <w:uiPriority w:val="99"/>
     <w:semiHidden/>
+    <w:unhideWhenUsed/>
   </w:style>
   <w:style w:type="paragraph" w:styleId="Caption">
     <w:name w:val="caption"/>
@@ -4654,6 +5097,17 @@
       <w:szCs w:val="24"/>
       <w:lang w:val="en-GB" w:eastAsia="en-US"/>
     </w:rPr>
+  </w:style>
+  <w:style w:type="paragraph" w:styleId="ListParagraph">
+    <w:name w:val="List Paragraph"/>
+    <w:basedOn w:val="Normal"/>
+    <w:uiPriority w:val="34"/>
+    <w:qFormat/>
+    <w:rsid w:val="007F2D83"/>
+    <w:pPr>
+      <w:ind w:left="720"/>
+      <w:contextualSpacing/>
+    </w:pPr>
   </w:style>
 </w:styles>
 </file>

</xml_diff>

<commit_message>
docs(project_report): write project objectives and reflection
</commit_message>
<xml_diff>
--- a/Documents/Design_Report_Template.docx
+++ b/Documents/Design_Report_Template.docx
@@ -1100,19 +1100,136 @@
           <w:tab w:val="num" w:pos="1290"/>
         </w:tabs>
         <w:jc w:val="both"/>
+        <w:rPr>
+          <w:lang w:val="en-SG"/>
+        </w:rPr>
       </w:pPr>
       <w:r>
         <w:t xml:space="preserve">     </w:t>
       </w:r>
       <w:r>
-        <w:t xml:space="preserve">State the objectives of </w:t>
-      </w:r>
-      <w:r>
-        <w:t>your</w:t>
-      </w:r>
-      <w:r>
-        <w:t xml:space="preserve"> project.</w:t>
-      </w:r>
+        <w:rPr>
+          <w:lang w:val="en-SG"/>
+        </w:rPr>
+        <w:t>The objective of this project is to develop a digital, role-based sandwich ordering system for Super Sandwich Store. For customers, the application</w:t>
+      </w:r>
+      <w:r>
+        <w:rPr>
+          <w:lang w:val="en-SG"/>
+        </w:rPr>
+        <w:t xml:space="preserve"> should</w:t>
+      </w:r>
+      <w:r>
+        <w:rPr>
+          <w:lang w:val="en-SG"/>
+        </w:rPr>
+        <w:t xml:space="preserve"> provide an intuitive self-service interface to </w:t>
+      </w:r>
+      <w:r>
+        <w:rPr>
+          <w:lang w:val="en-SG"/>
+        </w:rPr>
+        <w:t>create</w:t>
+      </w:r>
+      <w:r>
+        <w:rPr>
+          <w:lang w:val="en-SG"/>
+        </w:rPr>
+        <w:t xml:space="preserve"> orders with customisable bread types and ingredients, and to modify or confirm them with ease. For staff, the application </w:t>
+      </w:r>
+      <w:r>
+        <w:rPr>
+          <w:lang w:val="en-SG"/>
+        </w:rPr>
+        <w:t xml:space="preserve">should </w:t>
+      </w:r>
+      <w:r>
+        <w:rPr>
+          <w:lang w:val="en-SG"/>
+        </w:rPr>
+        <w:t>provide tools to create, edit, and delete bread types and ingredients on the menu, as well as view order summaries, monitor inventory, and calculate total sales to support daily operations</w:t>
+      </w:r>
+      <w:r>
+        <w:rPr>
+          <w:lang w:val="en-SG"/>
+        </w:rPr>
+        <w:t xml:space="preserve"> efficiently</w:t>
+      </w:r>
+      <w:r>
+        <w:rPr>
+          <w:lang w:val="en-SG"/>
+        </w:rPr>
+        <w:t xml:space="preserve">. UML diagrams are produced </w:t>
+      </w:r>
+      <w:r>
+        <w:rPr>
+          <w:lang w:val="en-SG"/>
+        </w:rPr>
+        <w:t>before</w:t>
+      </w:r>
+      <w:r>
+        <w:rPr>
+          <w:lang w:val="en-SG"/>
+        </w:rPr>
+        <w:t xml:space="preserve"> implementation to communicate the system design clearly, ensuring that stakeholders of Super Sandwich Store can understand the intended solution before development begins. These features are </w:t>
+      </w:r>
+      <w:r>
+        <w:rPr>
+          <w:lang w:val="en-SG"/>
+        </w:rPr>
+        <w:t xml:space="preserve">to be </w:t>
+      </w:r>
+      <w:r>
+        <w:rPr>
+          <w:lang w:val="en-SG"/>
+        </w:rPr>
+        <w:t>implemented in Java</w:t>
+      </w:r>
+      <w:r>
+        <w:rPr>
+          <w:lang w:val="en-SG"/>
+        </w:rPr>
+        <w:t xml:space="preserve"> to leverage </w:t>
+      </w:r>
+      <w:r>
+        <w:rPr>
+          <w:lang w:val="en-SG"/>
+        </w:rPr>
+        <w:t>its object-oriented capabilities to ensure a maintainable and extensible codebase that minimises future technical debt</w:t>
+      </w:r>
+      <w:r>
+        <w:rPr>
+          <w:lang w:val="en-SG"/>
+        </w:rPr>
+        <w:t xml:space="preserve"> as</w:t>
+      </w:r>
+      <w:r>
+        <w:rPr>
+          <w:lang w:val="en-SG"/>
+        </w:rPr>
+        <w:t xml:space="preserve"> </w:t>
+      </w:r>
+      <w:r>
+        <w:rPr>
+          <w:lang w:val="en-SG"/>
+        </w:rPr>
+        <w:t>a</w:t>
+      </w:r>
+      <w:r>
+        <w:rPr>
+          <w:lang w:val="en-SG"/>
+        </w:rPr>
+        <w:t>dditional features may be added to enhance the application’s usage for users.</w:t>
+      </w:r>
+    </w:p>
+    <w:p>
+      <w:pPr>
+        <w:tabs>
+          <w:tab w:val="left" w:pos="567"/>
+          <w:tab w:val="num" w:pos="1290"/>
+        </w:tabs>
+        <w:jc w:val="both"/>
+      </w:pPr>
     </w:p>
     <w:p>
       <w:pPr>
@@ -1188,6 +1305,9 @@
       <w:r>
         <w:t xml:space="preserve">Use Case Diagrams </w:t>
       </w:r>
+      <w:r>
+        <w:t>(include clear justification)</w:t>
+      </w:r>
     </w:p>
     <w:p>
       <w:pPr>
@@ -1284,6 +1404,18 @@
       <w:r>
         <w:t>Domain Class Diagram</w:t>
       </w:r>
+      <w:r>
+        <w:t xml:space="preserve"> </w:t>
+      </w:r>
+      <w:r>
+        <w:t>(include clear justification)</w:t>
+      </w:r>
+    </w:p>
+    <w:p>
+      <w:pPr>
+        <w:pStyle w:val="NoSpacing"/>
+        <w:ind w:left="720"/>
+      </w:pPr>
     </w:p>
     <w:p>
       <w:pPr>
@@ -1455,6 +1587,7 @@
               <w:pStyle w:val="NoSpacing"/>
             </w:pPr>
             <w:r>
+              <w:lastRenderedPageBreak/>
               <w:t xml:space="preserve">Create initial </w:t>
             </w:r>
             <w:r>
@@ -1530,6 +1663,9 @@
             <w:pPr>
               <w:pStyle w:val="NoSpacing"/>
             </w:pPr>
+            <w:r>
+              <w:t>Y</w:t>
+            </w:r>
           </w:p>
         </w:tc>
       </w:tr>
@@ -1609,7 +1745,7 @@
               <w:pStyle w:val="NoSpacing"/>
             </w:pPr>
             <w:r>
-              <w:t>Albus &amp; Shi Cheng</w:t>
+              <w:t>Albus</w:t>
             </w:r>
           </w:p>
         </w:tc>
@@ -1621,6 +1757,9 @@
             <w:pPr>
               <w:pStyle w:val="NoSpacing"/>
             </w:pPr>
+            <w:r>
+              <w:t>Y</w:t>
+            </w:r>
           </w:p>
         </w:tc>
       </w:tr>
@@ -1659,6 +1798,9 @@
             <w:pPr>
               <w:pStyle w:val="NoSpacing"/>
             </w:pPr>
+            <w:r>
+              <w:t>Y</w:t>
+            </w:r>
           </w:p>
         </w:tc>
       </w:tr>
@@ -1697,6 +1839,9 @@
             <w:pPr>
               <w:pStyle w:val="NoSpacing"/>
             </w:pPr>
+            <w:r>
+              <w:t>Y</w:t>
+            </w:r>
           </w:p>
         </w:tc>
       </w:tr>
@@ -1799,127 +1944,278 @@
     <w:p/>
     <w:p/>
     <w:p>
-      <w:r>
-        <w:t>Rough notes (Albus)</w:t>
-      </w:r>
-    </w:p>
-    <w:p>
-      <w:r>
-        <w:t xml:space="preserve">Problems: </w:t>
-      </w:r>
-    </w:p>
-    <w:p>
-      <w:pPr>
-        <w:pStyle w:val="ListParagraph"/>
-        <w:numPr>
-          <w:ilvl w:val="0"/>
-          <w:numId w:val="18"/>
-        </w:numPr>
-      </w:pPr>
-      <w:r>
-        <w:t>Setting up a GitHub repository initially with Eclipse is unintuitive</w:t>
-      </w:r>
-    </w:p>
-    <w:p>
-      <w:pPr>
-        <w:pStyle w:val="ListParagraph"/>
-        <w:numPr>
-          <w:ilvl w:val="0"/>
-          <w:numId w:val="18"/>
-        </w:numPr>
-      </w:pPr>
-      <w:r>
-        <w:t>Unsure of scope of project report requirements for features</w:t>
-      </w:r>
-    </w:p>
-    <w:p>
-      <w:pPr>
-        <w:pStyle w:val="ListParagraph"/>
-        <w:numPr>
-          <w:ilvl w:val="0"/>
-          <w:numId w:val="18"/>
-        </w:numPr>
-      </w:pPr>
-      <w:r>
-        <w:t>Unsure of what can be assumed and not assumed</w:t>
-      </w:r>
-    </w:p>
-    <w:p/>
-    <w:p>
-      <w:r>
-        <w:t>Learning:</w:t>
-      </w:r>
-    </w:p>
-    <w:p>
-      <w:pPr>
-        <w:pStyle w:val="ListParagraph"/>
-        <w:numPr>
-          <w:ilvl w:val="0"/>
-          <w:numId w:val="18"/>
-        </w:numPr>
-      </w:pPr>
-      <w:r>
-        <w:t>S</w:t>
-      </w:r>
-      <w:r>
-        <w:t>et up GitHub repository by utiliz</w:t>
-      </w:r>
-      <w:r>
-        <w:t>ing</w:t>
-      </w:r>
-      <w:r>
-        <w:t xml:space="preserve"> Claude AI to guide set-up</w:t>
-      </w:r>
-    </w:p>
-    <w:p>
-      <w:pPr>
-        <w:pStyle w:val="ListParagraph"/>
-        <w:numPr>
-          <w:ilvl w:val="0"/>
-          <w:numId w:val="18"/>
-        </w:numPr>
-      </w:pPr>
-      <w:r>
-        <w:t xml:space="preserve">Taking the initiative to ask questions to clarify </w:t>
-      </w:r>
-      <w:r>
-        <w:t>doubts rather than assuming</w:t>
-      </w:r>
-    </w:p>
-    <w:p>
-      <w:pPr>
-        <w:pStyle w:val="ListParagraph"/>
-        <w:numPr>
-          <w:ilvl w:val="0"/>
-          <w:numId w:val="18"/>
-        </w:numPr>
-      </w:pPr>
-      <w:r>
-        <w:t>Delegating and collaborating on tasks with others using GitHub</w:t>
-      </w:r>
-    </w:p>
-    <w:p/>
-    <w:p>
-      <w:r>
-        <w:t>Next Stage:</w:t>
-      </w:r>
-    </w:p>
-    <w:p>
-      <w:pPr>
-        <w:pStyle w:val="ListParagraph"/>
-        <w:numPr>
-          <w:ilvl w:val="0"/>
-          <w:numId w:val="18"/>
-        </w:numPr>
-      </w:pPr>
-      <w:r>
-        <w:t>TBD</w:t>
-      </w:r>
-    </w:p>
-    <w:p>
-      <w:r>
+      <w:pPr>
+        <w:rPr>
+          <w:lang w:val="en-SG"/>
+        </w:rPr>
+      </w:pPr>
+      <w:r>
+        <w:rPr>
+          <w:lang w:val="en-SG"/>
+        </w:rPr>
+        <w:t xml:space="preserve">Several difficulties arose during the early stages of the project. </w:t>
+      </w:r>
+      <w:r>
+        <w:rPr>
+          <w:lang w:val="en-SG"/>
+        </w:rPr>
+        <w:t xml:space="preserve">Personally, we found </w:t>
+      </w:r>
+      <w:r>
+        <w:rPr>
+          <w:lang w:val="en-SG"/>
+        </w:rPr>
+        <w:t>co</w:t>
+      </w:r>
+      <w:r>
+        <w:rPr>
+          <w:lang w:val="en-SG"/>
+        </w:rPr>
+        <w:t xml:space="preserve">nfiguring a shared GitHub repository within Eclipse </w:t>
+      </w:r>
+      <w:r>
+        <w:rPr>
+          <w:lang w:val="en-SG"/>
+        </w:rPr>
+        <w:t>to be very</w:t>
+      </w:r>
+      <w:r>
+        <w:rPr>
+          <w:lang w:val="en-SG"/>
+        </w:rPr>
+        <w:t xml:space="preserve"> unintuitive, as neither of us had prior experience with version control integration </w:t>
+      </w:r>
+      <w:r>
+        <w:rPr>
+          <w:lang w:val="en-SG"/>
+        </w:rPr>
+        <w:t>on</w:t>
+      </w:r>
+      <w:r>
+        <w:rPr>
+          <w:lang w:val="en-SG"/>
+        </w:rPr>
         <w:t xml:space="preserve"> </w:t>
       </w:r>
+      <w:r>
+        <w:rPr>
+          <w:lang w:val="en-SG"/>
+        </w:rPr>
+        <w:t>the IDE</w:t>
+      </w:r>
+      <w:r>
+        <w:rPr>
+          <w:lang w:val="en-SG"/>
+        </w:rPr>
+        <w:t xml:space="preserve">. </w:t>
+      </w:r>
+      <w:r>
+        <w:rPr>
+          <w:lang w:val="en-SG"/>
+        </w:rPr>
+        <w:t>We</w:t>
+      </w:r>
+      <w:r>
+        <w:rPr>
+          <w:lang w:val="en-SG"/>
+        </w:rPr>
+        <w:t xml:space="preserve"> also</w:t>
+      </w:r>
+      <w:r>
+        <w:rPr>
+          <w:lang w:val="en-SG"/>
+        </w:rPr>
+        <w:t xml:space="preserve"> had some</w:t>
+      </w:r>
+      <w:r>
+        <w:rPr>
+          <w:lang w:val="en-SG"/>
+        </w:rPr>
+        <w:t xml:space="preserve"> initial uncertainty around the scope of the design report, specifically regarding which use case relationships were appropriate and what assumptions </w:t>
+      </w:r>
+      <w:r>
+        <w:rPr>
+          <w:lang w:val="en-SG"/>
+        </w:rPr>
+        <w:t>could be made</w:t>
+      </w:r>
+      <w:r>
+        <w:rPr>
+          <w:lang w:val="en-SG"/>
+        </w:rPr>
+        <w:t xml:space="preserve"> when the specifications were ambiguous.</w:t>
+      </w:r>
+      <w:r>
+        <w:rPr>
+          <w:lang w:val="en-SG"/>
+        </w:rPr>
+        <w:br/>
+      </w:r>
+    </w:p>
+    <w:p>
+      <w:pPr>
+        <w:rPr>
+          <w:lang w:val="en-SG"/>
+        </w:rPr>
+      </w:pPr>
+      <w:r>
+        <w:rPr>
+          <w:lang w:val="en-SG"/>
+        </w:rPr>
+        <w:t>These challenges were addressed through proactive troubleshooting and communication. The GitHub issue was resolved by consulting Claude AI for step-by-step guidance</w:t>
+      </w:r>
+      <w:r>
+        <w:rPr>
+          <w:lang w:val="en-SG"/>
+        </w:rPr>
+        <w:t xml:space="preserve">. </w:t>
+      </w:r>
+      <w:r>
+        <w:rPr>
+          <w:lang w:val="en-SG"/>
+        </w:rPr>
+        <w:t>We also found Claude AI</w:t>
+      </w:r>
+      <w:r>
+        <w:rPr>
+          <w:lang w:val="en-SG"/>
+        </w:rPr>
+        <w:t xml:space="preserve"> to</w:t>
+      </w:r>
+      <w:r>
+        <w:rPr>
+          <w:lang w:val="en-SG"/>
+        </w:rPr>
+        <w:t xml:space="preserve"> be</w:t>
+      </w:r>
+      <w:r>
+        <w:rPr>
+          <w:lang w:val="en-SG"/>
+        </w:rPr>
+        <w:t xml:space="preserve"> </w:t>
+      </w:r>
+      <w:r>
+        <w:rPr>
+          <w:lang w:val="en-SG"/>
+        </w:rPr>
+        <w:t>good at</w:t>
+      </w:r>
+      <w:r>
+        <w:rPr>
+          <w:lang w:val="en-SG"/>
+        </w:rPr>
+        <w:t xml:space="preserve"> assisting</w:t>
+      </w:r>
+      <w:r>
+        <w:rPr>
+          <w:lang w:val="en-SG"/>
+        </w:rPr>
+        <w:t xml:space="preserve"> independent problem-solving. The uncertainty around the design report was resolved by consulting </w:t>
+      </w:r>
+      <w:r>
+        <w:rPr>
+          <w:lang w:val="en-SG"/>
+        </w:rPr>
+        <w:t>our OOP lecturer</w:t>
+      </w:r>
+      <w:r>
+        <w:rPr>
+          <w:lang w:val="en-SG"/>
+        </w:rPr>
+        <w:t xml:space="preserve"> and reviewing lecture materials more carefully, reinforcing the value of seeking clarification early rather than proceeding on unverified assumptions. Through constructing the UML diagrams, </w:t>
+      </w:r>
+      <w:r>
+        <w:rPr>
+          <w:lang w:val="en-SG"/>
+        </w:rPr>
+        <w:t>we</w:t>
+      </w:r>
+      <w:r>
+        <w:rPr>
+          <w:lang w:val="en-SG"/>
+        </w:rPr>
+        <w:t xml:space="preserve"> also developed a more grounded understanding of how object-oriented principles such as encapsulation and </w:t>
+      </w:r>
+      <w:r>
+        <w:rPr>
+          <w:lang w:val="en-SG"/>
+        </w:rPr>
+        <w:t>inheritance</w:t>
+      </w:r>
+      <w:r>
+        <w:rPr>
+          <w:lang w:val="en-SG"/>
+        </w:rPr>
+        <w:t xml:space="preserve"> translate from theory into a</w:t>
+      </w:r>
+      <w:r>
+        <w:rPr>
+          <w:lang w:val="en-SG"/>
+        </w:rPr>
+        <w:t>ctual</w:t>
+      </w:r>
+      <w:r>
+        <w:rPr>
+          <w:lang w:val="en-SG"/>
+        </w:rPr>
+        <w:t xml:space="preserve"> system design.</w:t>
+      </w:r>
+      <w:r>
+        <w:rPr>
+          <w:lang w:val="en-SG"/>
+        </w:rPr>
+        <w:br/>
+      </w:r>
+    </w:p>
+    <w:p>
+      <w:pPr>
+        <w:rPr>
+          <w:lang w:val="en-SG"/>
+        </w:rPr>
+      </w:pPr>
+      <w:r>
+        <w:rPr>
+          <w:lang w:val="en-SG"/>
+        </w:rPr>
+        <w:t xml:space="preserve">For the next stage, </w:t>
+      </w:r>
+      <w:r>
+        <w:rPr>
+          <w:lang w:val="en-SG"/>
+        </w:rPr>
+        <w:t>we</w:t>
+      </w:r>
+      <w:r>
+        <w:rPr>
+          <w:lang w:val="en-SG"/>
+        </w:rPr>
+        <w:t xml:space="preserve"> will begin coding the CRUD operations for Modules 1a and 1b using the domain class diagram as a</w:t>
+      </w:r>
+      <w:r>
+        <w:rPr>
+          <w:lang w:val="en-SG"/>
+        </w:rPr>
+        <w:t xml:space="preserve"> guide while</w:t>
+      </w:r>
+      <w:r>
+        <w:rPr>
+          <w:lang w:val="en-SG"/>
+        </w:rPr>
+        <w:t xml:space="preserve"> maintaining consistent progress through task delegation tracked on GitHub. We will also continue to communicate openly about work capacity and clarify doubts early to ensure a smooth </w:t>
+      </w:r>
+      <w:r>
+        <w:rPr>
+          <w:lang w:val="en-SG"/>
+        </w:rPr>
+        <w:t>collaboration experience.</w:t>
+      </w:r>
+    </w:p>
+    <w:p>
+      <w:pPr>
+        <w:rPr>
+          <w:lang w:val="en-SG"/>
+        </w:rPr>
+      </w:pPr>
     </w:p>
     <w:sectPr>
       <w:headerReference w:type="default" r:id="rId7"/>
@@ -4884,7 +5180,6 @@
   <w:style w:type="character" w:default="1" w:styleId="DefaultParagraphFont">
     <w:name w:val="Default Paragraph Font"/>
     <w:uiPriority w:val="1"/>
-    <w:semiHidden/>
     <w:unhideWhenUsed/>
   </w:style>
   <w:style w:type="table" w:default="1" w:styleId="TableNormal">

</xml_diff>